<commit_message>
ASVT rewrite second lab
</commit_message>
<xml_diff>
--- a/projects/SD/cursach/final/Курсач.docx
+++ b/projects/SD/cursach/final/Курсач.docx
@@ -83,13 +83,7 @@
         <w:rPr>
           <w:rFonts w:eastAsia="Times New Roman" w:cs="Times New Roman"/>
         </w:rPr>
-        <w:t xml:space="preserve">Институт </w:t>
-      </w:r>
-      <w:r>
-        <w:rPr>
-          <w:rFonts w:eastAsia="Times New Roman" w:cs="Times New Roman"/>
-        </w:rPr>
-        <w:t>компьютерных наук и кибербезопасности</w:t>
+        <w:t>Институт компьютерных наук и кибербезопасности</w:t>
       </w:r>
     </w:p>
     <w:p>
@@ -848,13 +842,7 @@
         <w:rPr>
           <w:rFonts w:eastAsia="Times New Roman" w:cs="Times New Roman"/>
         </w:rPr>
-        <w:t>202</w:t>
-      </w:r>
-      <w:r>
-        <w:rPr>
-          <w:rFonts w:eastAsia="Times New Roman" w:cs="Times New Roman"/>
-        </w:rPr>
-        <w:t>6 г.</w:t>
+        <w:t>2026 г.</w:t>
       </w:r>
       <w:r>
         <w:br w:type="page"/>
@@ -1509,11 +1497,7 @@
       </w:pPr>
       <w:r>
         <w:rPr/>
-        <w:t xml:space="preserve">Убрано создание временного файла "qr.ppm" на диске. </w:t>
-      </w:r>
-      <w:r>
-        <w:rPr/>
-        <w:t>Убрана работа с файлом и запись по ходу создания QR-кода, реализован расчет размера файла и запись непосредственно в память после всего вычисления.</w:t>
+        <w:t>Убрано создание временного файла "qr.ppm" на диске. Убрана работа с файлом и запись по ходу создания QR-кода, реализован расчет размера файла и запись непосредственно в память после всего вычисления.</w:t>
       </w:r>
     </w:p>
     <w:p>
@@ -1527,14 +1511,7 @@
       </w:pPr>
       <w:r>
         <w:rPr/>
-        <w:t>Реализована функция ppm_to_memory(), которая формирует PPM-данные в памяти</w:t>
-      </w:r>
-      <w:r>
-        <w:rPr/>
-        <w:t>(см. Рис 1)</w:t>
-      </w:r>
-      <w:r>
-        <w:rPr/>
+        <w:t>Реализована функция ppm_to_memory(), которая формирует PPM-данные в памяти(см. Рис 1)</w:t>
         <w:br/>
       </w:r>
     </w:p>
@@ -1599,15 +1576,7 @@
       </w:r>
       <w:r>
         <w:rPr/>
-        <w:t xml:space="preserve">Рис </w:t>
-      </w:r>
-      <w:r>
-        <w:rPr/>
-        <w:t>3</w:t>
-      </w:r>
-      <w:r>
-        <w:rPr/>
-        <w:t>. Функция ppm_to_memory()</w:t>
+        <w:t>Рис 3. Функция ppm_to_memory()</w:t>
       </w:r>
     </w:p>
     <w:p>
@@ -1633,19 +1602,7 @@
       </w:pPr>
       <w:r>
         <w:rPr/>
-        <w:t>2.</w:t>
-      </w:r>
-      <w:r>
-        <w:rPr/>
-        <w:t xml:space="preserve"> </w:t>
-      </w:r>
-      <w:r>
-        <w:rPr/>
-        <w:t xml:space="preserve">Замена </w:t>
-      </w:r>
-      <w:r>
-        <w:rPr/>
-        <w:t>структур данных:</w:t>
+        <w:t>2. Замена структур данных:</w:t>
       </w:r>
     </w:p>
     <w:p>
@@ -1659,15 +1616,7 @@
       </w:pPr>
       <w:r>
         <w:rPr/>
-        <w:t xml:space="preserve">Заменено многоуровневое выделение памяти (RGB** image = malloc(height * sizeof(RGB*)) + цикл malloc(width * sizeof(RGB))), </w:t>
-      </w:r>
-      <w:r>
-        <w:rPr/>
-        <w:t>р</w:t>
-      </w:r>
-      <w:r>
-        <w:rPr/>
-        <w:t>еализовано единое выделение непрерывного блока памяти с последующим разбиением на строки.</w:t>
+        <w:t>Заменено многоуровневое выделение памяти (RGB** image = malloc(height * sizeof(RGB*)) + цикл malloc(width * sizeof(RGB))), реализовано единое выделение непрерывного блока памяти с последующим разбиением на строки.</w:t>
       </w:r>
     </w:p>
     <w:p>
@@ -1747,11 +1696,7 @@
       </w:pPr>
       <w:r>
         <w:rPr/>
-        <w:t>3.</w:t>
-      </w:r>
-      <w:r>
-        <w:rPr/>
-        <w:t xml:space="preserve"> Упрощение логики обработки изображений: </w:t>
+        <w:t xml:space="preserve">3. Упрощение логики обработки изображений: </w:t>
       </w:r>
     </w:p>
     <w:p>
@@ -1765,11 +1710,7 @@
       </w:pPr>
       <w:r>
         <w:rPr/>
-        <w:t xml:space="preserve">Оптимизированы алгоритмы наложения цветов с использованием битовых операций. </w:t>
-      </w:r>
-      <w:r>
-        <w:rPr/>
-        <w:t xml:space="preserve">Раньше цикл проходил по всему массиву изображения и в двумерном массиве применял цвет, сейчас, так как память под изображение выденлена линейно, цветовую маску проще применить через побитовое ИЛИ. </w:t>
+        <w:t xml:space="preserve">Оптимизированы алгоритмы наложения цветов с использованием битовых операций. Раньше цикл проходил по всему массиву изображения и в двумерном массиве применял цвет, сейчас, так как память под изображение выденлена линейно, цветовую маску проще применить через побитовое ИЛИ. </w:t>
       </w:r>
     </w:p>
     <w:p>
@@ -1783,11 +1724,7 @@
       </w:pPr>
       <w:r>
         <w:rPr/>
-        <w:t xml:space="preserve">Упрощена логика центрирования QR-кодов в финальном изображении. </w:t>
-      </w:r>
-      <w:r>
-        <w:rPr/>
-        <w:t>Перемещено в функцию применения маски и упрощенной применение сдвига финального изображения.</w:t>
+        <w:t>Упрощена логика центрирования QR-кодов в финальном изображении. Перемещено в функцию применения маски и упрощенной применение сдвига финального изображения.</w:t>
       </w:r>
     </w:p>
     <w:p>
@@ -1910,11 +1847,7 @@
       </w:pPr>
       <w:r>
         <w:rPr/>
-        <w:t xml:space="preserve">5. </w:t>
-      </w:r>
-      <w:r>
-        <w:rPr/>
-        <w:t>Оптимизировано копирование данных с помощью memcpy вместо поэлементного копирования:</w:t>
+        <w:t>5. Оптимизировано копирование данных с помощью memcpy вместо поэлементного копирования:</w:t>
       </w:r>
     </w:p>
     <w:p>
@@ -2261,11 +2194,7 @@
       </w:pPr>
       <w:r>
         <w:rPr/>
-        <w:t xml:space="preserve">1.   </w:t>
-      </w:r>
-      <w:r>
-        <w:rPr/>
-        <w:t>Оптимизация алгоритма шифрования:</w:t>
+        <w:t>1.   Оптимизация алгоритма шифрования:</w:t>
       </w:r>
     </w:p>
     <w:p>
@@ -2273,7 +2202,7 @@
         <w:pStyle w:val="Normal"/>
         <w:numPr>
           <w:ilvl w:val="0"/>
-          <w:numId w:val="12"/>
+          <w:numId w:val="11"/>
         </w:numPr>
         <w:rPr/>
       </w:pPr>
@@ -2294,30 +2223,18 @@
       </w:pPr>
       <w:r>
         <w:rPr/>
-        <w:t xml:space="preserve">2. </w:t>
-      </w:r>
-      <w:r>
+        <w:t>2. Реализовано развертывание циклов для обработки нескольких байт за итерацию в несольких фукнциях: crypt_data(), create_qr_mask(), ppm_to_memory(), decrypt_data().</w:t>
+      </w:r>
+    </w:p>
+    <w:p>
+      <w:pPr>
+        <w:pStyle w:val="Normal"/>
+        <w:ind w:hanging="0" w:left="0"/>
         <w:rPr/>
-        <w:t xml:space="preserve">Реализовано развертывание циклов для обработки нескольких байт за итерацию </w:t>
-      </w:r>
+      </w:pPr>
       <w:r>
         <w:rPr/>
-        <w:t>в несольких фукнциях: crypt_data(), create_qr_mask(), ppm_to_memory(), decrypt_data().</w:t>
-      </w:r>
-    </w:p>
-    <w:p>
-      <w:pPr>
-        <w:pStyle w:val="Normal"/>
-        <w:ind w:hanging="0" w:left="0"/>
-        <w:rPr/>
-      </w:pPr>
-      <w:r>
-        <w:rPr/>
-        <w:t xml:space="preserve">3. </w:t>
-      </w:r>
-      <w:r>
-        <w:rPr/>
-        <w:t xml:space="preserve"> Оптимизация обработки изображений:</w:t>
+        <w:t>3.  Оптимизация обработки изображений:</w:t>
       </w:r>
     </w:p>
     <w:p>
@@ -2331,11 +2248,7 @@
       </w:pPr>
       <w:r>
         <w:rPr/>
-        <w:t xml:space="preserve">Заменены вложенные циклы на линейную обработку данных: </w:t>
-      </w:r>
-      <w:r>
-        <w:rPr/>
-        <w:t>ppm_to_memory(), apply_color_centered(), alloc_image(), create_qr_mask(), extract_color_channel().</w:t>
+        <w:t>Заменены вложенные циклы на линейную обработку данных: ppm_to_memory(), apply_color_centered(), alloc_image(), create_qr_mask(), extract_color_channel().</w:t>
       </w:r>
     </w:p>
     <w:p>
@@ -2634,11 +2547,7 @@
       </w:pPr>
       <w:r>
         <w:rPr/>
-        <w:t xml:space="preserve">1. </w:t>
-      </w:r>
-      <w:r>
-        <w:rPr/>
-        <w:t>Флаги компиляции:</w:t>
+        <w:t>1. Флаги компиляции:</w:t>
       </w:r>
     </w:p>
     <w:p>
@@ -2646,7 +2555,7 @@
         <w:pStyle w:val="Normal"/>
         <w:numPr>
           <w:ilvl w:val="0"/>
-          <w:numId w:val="14"/>
+          <w:numId w:val="12"/>
         </w:numPr>
         <w:rPr/>
       </w:pPr>
@@ -2660,7 +2569,7 @@
         <w:pStyle w:val="Normal"/>
         <w:numPr>
           <w:ilvl w:val="0"/>
-          <w:numId w:val="14"/>
+          <w:numId w:val="12"/>
         </w:numPr>
         <w:rPr/>
       </w:pPr>
@@ -2674,7 +2583,7 @@
         <w:pStyle w:val="Normal"/>
         <w:numPr>
           <w:ilvl w:val="0"/>
-          <w:numId w:val="14"/>
+          <w:numId w:val="12"/>
         </w:numPr>
         <w:rPr/>
       </w:pPr>
@@ -2688,7 +2597,7 @@
         <w:pStyle w:val="Normal"/>
         <w:numPr>
           <w:ilvl w:val="0"/>
-          <w:numId w:val="14"/>
+          <w:numId w:val="12"/>
         </w:numPr>
         <w:rPr/>
       </w:pPr>
@@ -2793,7 +2702,7 @@
         <w:pStyle w:val="Normal"/>
         <w:numPr>
           <w:ilvl w:val="0"/>
-          <w:numId w:val="15"/>
+          <w:numId w:val="13"/>
         </w:numPr>
         <w:rPr/>
       </w:pPr>
@@ -2894,11 +2803,36 @@
       </w:pPr>
       <w:r>
         <w:rPr/>
-        <w:t xml:space="preserve">3. Использован спецификатор inline, который сообщает компилятору, что функцию нужно вставить в код, где она вызывается. </w:t>
-      </w:r>
-      <w:r>
+        <w:t>3. Использован спецификатор inline, который сообщает компилятору, что функцию нужно вставить в код, где она вызывается. Используется в apply_color_centered() и extract_color_channel().</w:t>
+      </w:r>
+    </w:p>
+    <w:p>
+      <w:pPr>
+        <w:pStyle w:val="Normal"/>
+        <w:numPr>
+          <w:ilvl w:val="0"/>
+          <w:numId w:val="0"/>
+        </w:numPr>
+        <w:ind w:hanging="0" w:left="0"/>
         <w:rPr/>
-        <w:t>Используется в apply_color_centered() и extract_color_channel().</w:t>
+      </w:pPr>
+      <w:r>
+        <w:rPr/>
+      </w:r>
+    </w:p>
+    <w:p>
+      <w:pPr>
+        <w:pStyle w:val="Normal"/>
+        <w:numPr>
+          <w:ilvl w:val="0"/>
+          <w:numId w:val="0"/>
+        </w:numPr>
+        <w:ind w:hanging="0" w:left="0"/>
+        <w:rPr/>
+      </w:pPr>
+      <w:r>
+        <w:rPr/>
+        <w:t>4. Изменен тип данных в структуре хранения изображения RGB c int на unsigned char, но это дало оптимизацию по памяти в пределах погрешности из-за относительно небольшого размера изображения.</w:t>
       </w:r>
     </w:p>
     <w:p>
@@ -3123,15 +3057,7 @@
             </w:r>
             <w:r>
               <w:rPr/>
-              <w:t xml:space="preserve">10 </w:t>
-            </w:r>
-            <w:r>
-              <w:rPr/>
-              <w:t>197</w:t>
-            </w:r>
-            <w:r>
-              <w:rPr/>
-              <w:t xml:space="preserve"> КБ</w:t>
+              <w:t>10 197 КБ</w:t>
             </w:r>
           </w:p>
         </w:tc>
@@ -3200,35 +3126,32 @@
         <w:rPr>
           <w:b/>
         </w:rPr>
-        <w:t>3</w:t>
-      </w:r>
-      <w:r>
-        <w:rPr>
-          <w:b/>
-        </w:rPr>
-        <w:t xml:space="preserve">. </w:t>
-      </w:r>
-      <w:r>
-        <w:rPr>
-          <w:b/>
-        </w:rPr>
-        <w:t>ВЫВОД</w:t>
-      </w:r>
-    </w:p>
-    <w:p>
-      <w:pPr>
-        <w:pStyle w:val="Normal"/>
-        <w:rPr>
-          <w:b w:val="false"/>
-          <w:bCs w:val="false"/>
-        </w:rPr>
-      </w:pPr>
-      <w:r>
-        <w:rPr>
-          <w:b w:val="false"/>
-          <w:bCs w:val="false"/>
-        </w:rPr>
-        <w:t>В ходе работы были изучены на практике различные методы оптимизации программы. Была успешна оптимизирована курсовая работа прошлого года. Программа была оптимизирована на 39 процентов по времени и на 10 процентов по памяти.</w:t>
+        <w:t>3. ВЫВОД</w:t>
+      </w:r>
+    </w:p>
+    <w:p>
+      <w:pPr>
+        <w:pStyle w:val="Normal"/>
+        <w:rPr>
+          <w:b w:val="false"/>
+          <w:bCs w:val="false"/>
+        </w:rPr>
+      </w:pPr>
+      <w:r>
+        <w:rPr>
+          <w:b w:val="false"/>
+          <w:bCs w:val="false"/>
+        </w:rPr>
+        <w:t xml:space="preserve">В ходе работы были изучены на практике различные методы оптимизации программы. Была успешна оптимизирована курсовая работа прошлого года. Программа была оптимизирована на 39 процентов по времени и на 10 процентов по памяти. </w:t>
+      </w:r>
+      <w:r>
+        <w:rPr>
+          <w:b w:val="false"/>
+          <w:bCs w:val="false"/>
+        </w:rPr>
+        <w:t>Алгоритмические оптимизации дали наибольший эффект по времени выполнения программы, по памяти лучшее дали оптимизации машино-независимые. Это происходит потому, что программист меняет саму математическую основу программы эквиваентным и более быстрым вариантом, тогда как компиляторы не меняют код напрямую, они добавляют небольшие вставки для оптимизации. В результате выполнения этой работы были получены знания в области модификаторов и квалификаторов, представлении работы оперативно</w:t>
+        <w:tab/>
+        <w:t xml:space="preserve"> памяти в ЭВМ и флаги оптимизации компилятора gcc. </w:t>
       </w:r>
     </w:p>
     <w:p>
@@ -30297,125 +30220,6 @@
   <w:abstractNum w:abstractNumId="11">
     <w:lvl w:ilvl="0">
       <w:start w:val="1"/>
-      <w:numFmt w:val="decimal"/>
-      <w:lvlText w:val="%1."/>
-      <w:lvlJc w:val="left"/>
-      <w:pPr>
-        <w:tabs>
-          <w:tab w:val="num" w:pos="720"/>
-        </w:tabs>
-        <w:ind w:left="720" w:hanging="360"/>
-      </w:pPr>
-      <w:rPr/>
-    </w:lvl>
-    <w:lvl w:ilvl="1">
-      <w:start w:val="1"/>
-      <w:numFmt w:val="decimal"/>
-      <w:lvlText w:val="%2."/>
-      <w:lvlJc w:val="left"/>
-      <w:pPr>
-        <w:tabs>
-          <w:tab w:val="num" w:pos="1080"/>
-        </w:tabs>
-        <w:ind w:left="1080" w:hanging="360"/>
-      </w:pPr>
-      <w:rPr/>
-    </w:lvl>
-    <w:lvl w:ilvl="2">
-      <w:start w:val="1"/>
-      <w:numFmt w:val="decimal"/>
-      <w:lvlText w:val="%3."/>
-      <w:lvlJc w:val="left"/>
-      <w:pPr>
-        <w:tabs>
-          <w:tab w:val="num" w:pos="1440"/>
-        </w:tabs>
-        <w:ind w:left="1440" w:hanging="360"/>
-      </w:pPr>
-      <w:rPr/>
-    </w:lvl>
-    <w:lvl w:ilvl="3">
-      <w:start w:val="1"/>
-      <w:numFmt w:val="decimal"/>
-      <w:lvlText w:val="%4."/>
-      <w:lvlJc w:val="left"/>
-      <w:pPr>
-        <w:tabs>
-          <w:tab w:val="num" w:pos="1800"/>
-        </w:tabs>
-        <w:ind w:left="1800" w:hanging="360"/>
-      </w:pPr>
-      <w:rPr/>
-    </w:lvl>
-    <w:lvl w:ilvl="4">
-      <w:start w:val="1"/>
-      <w:numFmt w:val="decimal"/>
-      <w:lvlText w:val="%5."/>
-      <w:lvlJc w:val="left"/>
-      <w:pPr>
-        <w:tabs>
-          <w:tab w:val="num" w:pos="2160"/>
-        </w:tabs>
-        <w:ind w:left="2160" w:hanging="360"/>
-      </w:pPr>
-      <w:rPr/>
-    </w:lvl>
-    <w:lvl w:ilvl="5">
-      <w:start w:val="1"/>
-      <w:numFmt w:val="decimal"/>
-      <w:lvlText w:val="%6."/>
-      <w:lvlJc w:val="left"/>
-      <w:pPr>
-        <w:tabs>
-          <w:tab w:val="num" w:pos="2520"/>
-        </w:tabs>
-        <w:ind w:left="2520" w:hanging="360"/>
-      </w:pPr>
-      <w:rPr/>
-    </w:lvl>
-    <w:lvl w:ilvl="6">
-      <w:start w:val="1"/>
-      <w:numFmt w:val="decimal"/>
-      <w:lvlText w:val="%7."/>
-      <w:lvlJc w:val="left"/>
-      <w:pPr>
-        <w:tabs>
-          <w:tab w:val="num" w:pos="2880"/>
-        </w:tabs>
-        <w:ind w:left="2880" w:hanging="360"/>
-      </w:pPr>
-      <w:rPr/>
-    </w:lvl>
-    <w:lvl w:ilvl="7">
-      <w:start w:val="1"/>
-      <w:numFmt w:val="decimal"/>
-      <w:lvlText w:val="%8."/>
-      <w:lvlJc w:val="left"/>
-      <w:pPr>
-        <w:tabs>
-          <w:tab w:val="num" w:pos="3240"/>
-        </w:tabs>
-        <w:ind w:left="3240" w:hanging="360"/>
-      </w:pPr>
-      <w:rPr/>
-    </w:lvl>
-    <w:lvl w:ilvl="8">
-      <w:start w:val="1"/>
-      <w:numFmt w:val="decimal"/>
-      <w:lvlText w:val="%9."/>
-      <w:lvlJc w:val="left"/>
-      <w:pPr>
-        <w:tabs>
-          <w:tab w:val="num" w:pos="3600"/>
-        </w:tabs>
-        <w:ind w:left="3600" w:hanging="360"/>
-      </w:pPr>
-      <w:rPr/>
-    </w:lvl>
-  </w:abstractNum>
-  <w:abstractNum w:abstractNumId="12">
-    <w:lvl w:ilvl="0">
-      <w:start w:val="1"/>
       <w:numFmt w:val="bullet"/>
       <w:lvlText w:val=""/>
       <w:lvlJc w:val="left"/>
@@ -30550,126 +30354,7 @@
       </w:rPr>
     </w:lvl>
   </w:abstractNum>
-  <w:abstractNum w:abstractNumId="13">
-    <w:lvl w:ilvl="0">
-      <w:start w:val="1"/>
-      <w:numFmt w:val="decimal"/>
-      <w:lvlText w:val="%1."/>
-      <w:lvlJc w:val="left"/>
-      <w:pPr>
-        <w:tabs>
-          <w:tab w:val="num" w:pos="720"/>
-        </w:tabs>
-        <w:ind w:left="720" w:hanging="360"/>
-      </w:pPr>
-      <w:rPr/>
-    </w:lvl>
-    <w:lvl w:ilvl="1">
-      <w:start w:val="1"/>
-      <w:numFmt w:val="decimal"/>
-      <w:lvlText w:val="%2."/>
-      <w:lvlJc w:val="left"/>
-      <w:pPr>
-        <w:tabs>
-          <w:tab w:val="num" w:pos="1080"/>
-        </w:tabs>
-        <w:ind w:left="1080" w:hanging="360"/>
-      </w:pPr>
-      <w:rPr/>
-    </w:lvl>
-    <w:lvl w:ilvl="2">
-      <w:start w:val="1"/>
-      <w:numFmt w:val="decimal"/>
-      <w:lvlText w:val="%3."/>
-      <w:lvlJc w:val="left"/>
-      <w:pPr>
-        <w:tabs>
-          <w:tab w:val="num" w:pos="1440"/>
-        </w:tabs>
-        <w:ind w:left="1440" w:hanging="360"/>
-      </w:pPr>
-      <w:rPr/>
-    </w:lvl>
-    <w:lvl w:ilvl="3">
-      <w:start w:val="1"/>
-      <w:numFmt w:val="decimal"/>
-      <w:lvlText w:val="%4."/>
-      <w:lvlJc w:val="left"/>
-      <w:pPr>
-        <w:tabs>
-          <w:tab w:val="num" w:pos="1800"/>
-        </w:tabs>
-        <w:ind w:left="1800" w:hanging="360"/>
-      </w:pPr>
-      <w:rPr/>
-    </w:lvl>
-    <w:lvl w:ilvl="4">
-      <w:start w:val="1"/>
-      <w:numFmt w:val="decimal"/>
-      <w:lvlText w:val="%5."/>
-      <w:lvlJc w:val="left"/>
-      <w:pPr>
-        <w:tabs>
-          <w:tab w:val="num" w:pos="2160"/>
-        </w:tabs>
-        <w:ind w:left="2160" w:hanging="360"/>
-      </w:pPr>
-      <w:rPr/>
-    </w:lvl>
-    <w:lvl w:ilvl="5">
-      <w:start w:val="1"/>
-      <w:numFmt w:val="decimal"/>
-      <w:lvlText w:val="%6."/>
-      <w:lvlJc w:val="left"/>
-      <w:pPr>
-        <w:tabs>
-          <w:tab w:val="num" w:pos="2520"/>
-        </w:tabs>
-        <w:ind w:left="2520" w:hanging="360"/>
-      </w:pPr>
-      <w:rPr/>
-    </w:lvl>
-    <w:lvl w:ilvl="6">
-      <w:start w:val="1"/>
-      <w:numFmt w:val="decimal"/>
-      <w:lvlText w:val="%7."/>
-      <w:lvlJc w:val="left"/>
-      <w:pPr>
-        <w:tabs>
-          <w:tab w:val="num" w:pos="2880"/>
-        </w:tabs>
-        <w:ind w:left="2880" w:hanging="360"/>
-      </w:pPr>
-      <w:rPr/>
-    </w:lvl>
-    <w:lvl w:ilvl="7">
-      <w:start w:val="1"/>
-      <w:numFmt w:val="decimal"/>
-      <w:lvlText w:val="%8."/>
-      <w:lvlJc w:val="left"/>
-      <w:pPr>
-        <w:tabs>
-          <w:tab w:val="num" w:pos="3240"/>
-        </w:tabs>
-        <w:ind w:left="3240" w:hanging="360"/>
-      </w:pPr>
-      <w:rPr/>
-    </w:lvl>
-    <w:lvl w:ilvl="8">
-      <w:start w:val="1"/>
-      <w:numFmt w:val="decimal"/>
-      <w:lvlText w:val="%9."/>
-      <w:lvlJc w:val="left"/>
-      <w:pPr>
-        <w:tabs>
-          <w:tab w:val="num" w:pos="3600"/>
-        </w:tabs>
-        <w:ind w:left="3600" w:hanging="360"/>
-      </w:pPr>
-      <w:rPr/>
-    </w:lvl>
-  </w:abstractNum>
-  <w:abstractNum w:abstractNumId="14">
+  <w:abstractNum w:abstractNumId="12">
     <w:lvl w:ilvl="0">
       <w:start w:val="1"/>
       <w:numFmt w:val="bullet"/>
@@ -30806,7 +30491,7 @@
       </w:rPr>
     </w:lvl>
   </w:abstractNum>
-  <w:abstractNum w:abstractNumId="15">
+  <w:abstractNum w:abstractNumId="13">
     <w:lvl w:ilvl="0">
       <w:start w:val="1"/>
       <w:numFmt w:val="bullet"/>
@@ -30943,7 +30628,7 @@
       </w:rPr>
     </w:lvl>
   </w:abstractNum>
-  <w:abstractNum w:abstractNumId="16">
+  <w:abstractNum w:abstractNumId="14">
     <w:lvl w:ilvl="0">
       <w:start w:val="1"/>
       <w:numFmt w:val="none"/>
@@ -31103,12 +30788,6 @@
   </w:num>
   <w:num w:numId="14">
     <w:abstractNumId w:val="14"/>
-  </w:num>
-  <w:num w:numId="15">
-    <w:abstractNumId w:val="15"/>
-  </w:num>
-  <w:num w:numId="16">
-    <w:abstractNumId w:val="16"/>
   </w:num>
 </w:numbering>
 </file>
@@ -31508,37 +31187,37 @@
         <a:srgbClr val="000000"/>
       </a:dk1>
       <a:lt1>
-        <a:srgbClr val="FFFFFF"/>
+        <a:srgbClr val="ffffff"/>
       </a:lt1>
       <a:dk2>
-        <a:srgbClr val="44546A"/>
+        <a:srgbClr val="44546a"/>
       </a:dk2>
       <a:lt2>
-        <a:srgbClr val="E7E6E6"/>
+        <a:srgbClr val="e7e6e6"/>
       </a:lt2>
       <a:accent1>
-        <a:srgbClr val="4472C4"/>
+        <a:srgbClr val="4472c4"/>
       </a:accent1>
       <a:accent2>
-        <a:srgbClr val="ED7D31"/>
+        <a:srgbClr val="ed7d31"/>
       </a:accent2>
       <a:accent3>
-        <a:srgbClr val="A5A5A5"/>
+        <a:srgbClr val="a5a5a5"/>
       </a:accent3>
       <a:accent4>
-        <a:srgbClr val="FFC000"/>
+        <a:srgbClr val="ffc000"/>
       </a:accent4>
       <a:accent5>
-        <a:srgbClr val="5B9BD5"/>
+        <a:srgbClr val="5b9bd5"/>
       </a:accent5>
       <a:accent6>
-        <a:srgbClr val="70AD47"/>
+        <a:srgbClr val="70ad47"/>
       </a:accent6>
       <a:hlink>
-        <a:srgbClr val="0563C1"/>
+        <a:srgbClr val="0563c1"/>
       </a:hlink>
       <a:folHlink>
-        <a:srgbClr val="954F72"/>
+        <a:srgbClr val="954f72"/>
       </a:folHlink>
     </a:clrScheme>
     <a:fontScheme name="Стандартная">

</xml_diff>